<commit_message>
TS 6 Tamil final
</commit_message>
<xml_diff>
--- a/saMhitA/06/TS 6 Tamil Corrections.docx
+++ b/saMhitA/06/TS 6 Tamil Corrections.docx
@@ -89,10 +89,30 @@
           <w:bCs/>
           <w:sz w:val="32"/>
           <w:szCs w:val="32"/>
-          <w:highlight w:val="red"/>
           <w:u w:val="single"/>
         </w:rPr>
-        <w:t>?????</w:t>
+        <w:t>30</w:t>
+      </w:r>
+      <w:r>
+        <w:rPr>
+          <w:b/>
+          <w:bCs/>
+          <w:sz w:val="32"/>
+          <w:szCs w:val="32"/>
+          <w:u w:val="single"/>
+          <w:vertAlign w:val="superscript"/>
+        </w:rPr>
+        <w:t>th</w:t>
+      </w:r>
+      <w:r>
+        <w:rPr>
+          <w:b/>
+          <w:bCs/>
+          <w:sz w:val="32"/>
+          <w:szCs w:val="32"/>
+          <w:u w:val="single"/>
+        </w:rPr>
+        <w:t xml:space="preserve"> April 2026</w:t>
       </w:r>
     </w:p>
     <w:p>
@@ -267,7 +287,18 @@
                 <w:sz w:val="28"/>
                 <w:szCs w:val="28"/>
               </w:rPr>
-              <w:t>TS 6.1.</w:t>
+              <w:t xml:space="preserve">TS </w:t>
+            </w:r>
+            <w:proofErr w:type="gramStart"/>
+            <w:r>
+              <w:rPr>
+                <w:rFonts w:cs="Arial"/>
+                <w:b/>
+                <w:bCs/>
+                <w:sz w:val="28"/>
+                <w:szCs w:val="28"/>
+              </w:rPr>
+              <w:t>6.1.</w:t>
             </w:r>
             <w:r>
               <w:rPr>
@@ -287,7 +318,18 @@
                 <w:sz w:val="28"/>
                 <w:szCs w:val="28"/>
               </w:rPr>
-              <w:t xml:space="preserve"> - </w:t>
+              <w:t xml:space="preserve"> -</w:t>
+            </w:r>
+            <w:proofErr w:type="gramEnd"/>
+            <w:r>
+              <w:rPr>
+                <w:rFonts w:cs="Arial"/>
+                <w:b/>
+                <w:bCs/>
+                <w:sz w:val="28"/>
+                <w:szCs w:val="28"/>
+              </w:rPr>
+              <w:t xml:space="preserve"> </w:t>
             </w:r>
             <w:r>
               <w:rPr>
@@ -840,7 +882,18 @@
                 <w:sz w:val="28"/>
                 <w:szCs w:val="28"/>
               </w:rPr>
-              <w:t>TS 6.1.</w:t>
+              <w:t xml:space="preserve">TS </w:t>
+            </w:r>
+            <w:proofErr w:type="gramStart"/>
+            <w:r>
+              <w:rPr>
+                <w:rFonts w:cs="Arial"/>
+                <w:b/>
+                <w:bCs/>
+                <w:sz w:val="28"/>
+                <w:szCs w:val="28"/>
+              </w:rPr>
+              <w:t>6.1.</w:t>
             </w:r>
             <w:r>
               <w:rPr>
@@ -860,7 +913,18 @@
                 <w:sz w:val="28"/>
                 <w:szCs w:val="28"/>
               </w:rPr>
-              <w:t xml:space="preserve"> - </w:t>
+              <w:t xml:space="preserve"> -</w:t>
+            </w:r>
+            <w:proofErr w:type="gramEnd"/>
+            <w:r>
+              <w:rPr>
+                <w:rFonts w:cs="Arial"/>
+                <w:b/>
+                <w:bCs/>
+                <w:sz w:val="28"/>
+                <w:szCs w:val="28"/>
+              </w:rPr>
+              <w:t xml:space="preserve"> </w:t>
             </w:r>
             <w:r>
               <w:rPr>
@@ -1408,7 +1472,29 @@
                 <w:sz w:val="28"/>
                 <w:szCs w:val="28"/>
               </w:rPr>
-              <w:t>TS 6.1.6.4  - Vaakyam</w:t>
+              <w:t xml:space="preserve">TS </w:t>
+            </w:r>
+            <w:proofErr w:type="gramStart"/>
+            <w:r>
+              <w:rPr>
+                <w:rFonts w:cs="Arial"/>
+                <w:b/>
+                <w:bCs/>
+                <w:sz w:val="28"/>
+                <w:szCs w:val="28"/>
+              </w:rPr>
+              <w:t>6.1.6.4  -</w:t>
+            </w:r>
+            <w:proofErr w:type="gramEnd"/>
+            <w:r>
+              <w:rPr>
+                <w:rFonts w:cs="Arial"/>
+                <w:b/>
+                <w:bCs/>
+                <w:sz w:val="28"/>
+                <w:szCs w:val="28"/>
+              </w:rPr>
+              <w:t xml:space="preserve"> Vaakyam</w:t>
             </w:r>
           </w:p>
           <w:p>
@@ -1702,6 +1788,586 @@
                 <w:lang w:bidi="ta-IN"/>
               </w:rPr>
               <w:t>தீ</w:t>
+            </w:r>
+          </w:p>
+        </w:tc>
+      </w:tr>
+      <w:tr>
+        <w:tc>
+          <w:tcPr>
+            <w:tcW w:w="3658" w:type="dxa"/>
+          </w:tcPr>
+          <w:p>
+            <w:pPr>
+              <w:widowControl w:val="0"/>
+              <w:autoSpaceDE w:val="0"/>
+              <w:autoSpaceDN w:val="0"/>
+              <w:adjustRightInd w:val="0"/>
+              <w:spacing w:before="0"/>
+              <w:rPr>
+                <w:rFonts w:cs="Arial"/>
+                <w:b/>
+                <w:bCs/>
+                <w:sz w:val="28"/>
+                <w:szCs w:val="28"/>
+              </w:rPr>
+            </w:pPr>
+            <w:r>
+              <w:rPr>
+                <w:rFonts w:cs="Arial"/>
+                <w:b/>
+                <w:bCs/>
+                <w:sz w:val="28"/>
+                <w:szCs w:val="28"/>
+              </w:rPr>
+              <w:t>TS 6.</w:t>
+            </w:r>
+            <w:r>
+              <w:rPr>
+                <w:rFonts w:cs="Arial"/>
+                <w:b/>
+                <w:bCs/>
+                <w:sz w:val="28"/>
+                <w:szCs w:val="28"/>
+              </w:rPr>
+              <w:t>1</w:t>
+            </w:r>
+            <w:r>
+              <w:rPr>
+                <w:rFonts w:cs="Arial"/>
+                <w:b/>
+                <w:bCs/>
+                <w:sz w:val="28"/>
+                <w:szCs w:val="28"/>
+              </w:rPr>
+              <w:t>.</w:t>
+            </w:r>
+            <w:r>
+              <w:rPr>
+                <w:rFonts w:cs="Arial"/>
+                <w:b/>
+                <w:bCs/>
+                <w:sz w:val="28"/>
+                <w:szCs w:val="28"/>
+              </w:rPr>
+              <w:t>8.2</w:t>
+            </w:r>
+            <w:r>
+              <w:rPr>
+                <w:rFonts w:cs="Arial"/>
+                <w:b/>
+                <w:bCs/>
+                <w:sz w:val="28"/>
+                <w:szCs w:val="28"/>
+              </w:rPr>
+              <w:t xml:space="preserve"> - Vaakyam</w:t>
+            </w:r>
+          </w:p>
+          <w:p>
+            <w:pPr>
+              <w:widowControl w:val="0"/>
+              <w:autoSpaceDE w:val="0"/>
+              <w:autoSpaceDN w:val="0"/>
+              <w:adjustRightInd w:val="0"/>
+              <w:spacing w:before="0"/>
+              <w:rPr>
+                <w:rFonts w:cs="Arial"/>
+                <w:b/>
+                <w:bCs/>
+                <w:sz w:val="28"/>
+                <w:szCs w:val="28"/>
+              </w:rPr>
+            </w:pPr>
+            <w:r>
+              <w:rPr>
+                <w:rFonts w:cs="Arial"/>
+                <w:b/>
+                <w:bCs/>
+                <w:sz w:val="28"/>
+                <w:szCs w:val="28"/>
+              </w:rPr>
+              <w:t xml:space="preserve">Line No. </w:t>
+            </w:r>
+            <w:r>
+              <w:rPr>
+                <w:rFonts w:cs="Arial"/>
+                <w:b/>
+                <w:bCs/>
+                <w:sz w:val="28"/>
+                <w:szCs w:val="28"/>
+              </w:rPr>
+              <w:t>- 3</w:t>
+            </w:r>
+          </w:p>
+          <w:p>
+            <w:pPr>
+              <w:spacing w:before="0" w:line="240" w:lineRule="auto"/>
+              <w:rPr>
+                <w:b/>
+                <w:bCs/>
+                <w:sz w:val="32"/>
+                <w:szCs w:val="32"/>
+              </w:rPr>
+            </w:pPr>
+            <w:r>
+              <w:rPr>
+                <w:rFonts w:cs="Arial"/>
+                <w:b/>
+                <w:bCs/>
+                <w:sz w:val="28"/>
+                <w:szCs w:val="28"/>
+              </w:rPr>
+              <w:t xml:space="preserve">Panchaati No. </w:t>
+            </w:r>
+            <w:r>
+              <w:rPr>
+                <w:rFonts w:cs="Arial"/>
+                <w:b/>
+                <w:bCs/>
+                <w:sz w:val="28"/>
+                <w:szCs w:val="28"/>
+              </w:rPr>
+              <w:t>- 55</w:t>
+            </w:r>
+          </w:p>
+        </w:tc>
+        <w:tc>
+          <w:tcPr>
+            <w:tcW w:w="4706" w:type="dxa"/>
+            <w:gridSpan w:val="2"/>
+          </w:tcPr>
+          <w:p>
+            <w:pPr>
+              <w:spacing w:before="0" w:line="240" w:lineRule="auto"/>
+              <w:rPr>
+                <w:b/>
+                <w:bCs/>
+                <w:sz w:val="32"/>
+                <w:szCs w:val="32"/>
+              </w:rPr>
+            </w:pPr>
+            <w:r>
+              <w:rPr>
+                <w:rFonts w:ascii="Latha" w:hAnsi="Latha" w:cs="Latha" w:hint="cs"/>
+                <w:sz w:val="28"/>
+                <w:szCs w:val="28"/>
+                <w:cs/>
+                <w:lang w:bidi="ta-IN"/>
+              </w:rPr>
+              <w:t>ப்</w:t>
+            </w:r>
+            <w:r>
+              <w:rPr>
+                <w:rFonts w:ascii="Latha" w:hAnsi="Latha" w:cs="Latha" w:hint="cs"/>
+                <w:b/>
+                <w:bCs/>
+                <w:position w:val="-12"/>
+                <w:sz w:val="28"/>
+                <w:szCs w:val="28"/>
+                <w:cs/>
+                <w:lang w:bidi="ta-IN"/>
+              </w:rPr>
+              <w:t>3</w:t>
+            </w:r>
+            <w:r>
+              <w:rPr>
+                <w:rFonts w:ascii="Latha" w:hAnsi="Latha" w:cs="Latha" w:hint="cs"/>
+                <w:sz w:val="28"/>
+                <w:szCs w:val="28"/>
+                <w:cs/>
+                <w:lang w:bidi="ta-IN"/>
+              </w:rPr>
+              <w:t>ரஹ்ம</w:t>
+            </w:r>
+            <w:r>
+              <w:rPr>
+                <w:rFonts w:ascii="BRH Tamil Tab Extra" w:hAnsi="BRH Tamil Tab Extra"/>
+                <w:b/>
+                <w:sz w:val="36"/>
+                <w:szCs w:val="28"/>
+              </w:rPr>
+              <w:t>†</w:t>
+            </w:r>
+            <w:r>
+              <w:rPr>
+                <w:rFonts w:ascii="Latha" w:hAnsi="Latha" w:cs="Latha" w:hint="cs"/>
+                <w:sz w:val="28"/>
+                <w:szCs w:val="28"/>
+                <w:highlight w:val="yellow"/>
+                <w:cs/>
+                <w:lang w:bidi="ta-IN"/>
+              </w:rPr>
+              <w:t>ணை</w:t>
+            </w:r>
+            <w:r>
+              <w:rPr>
+                <w:rFonts w:ascii="BRH Tamil Tab Extra" w:hAnsi="BRH Tamil Tab Extra"/>
+                <w:b/>
+                <w:sz w:val="36"/>
+                <w:szCs w:val="28"/>
+                <w:highlight w:val="yellow"/>
+              </w:rPr>
+              <w:t>…</w:t>
+            </w:r>
+            <w:r>
+              <w:rPr>
+                <w:rFonts w:ascii="Latha" w:hAnsi="Latha" w:cs="Latha" w:hint="cs"/>
+                <w:sz w:val="28"/>
+                <w:szCs w:val="28"/>
+                <w:highlight w:val="yellow"/>
+                <w:cs/>
+                <w:lang w:bidi="ta-IN"/>
+              </w:rPr>
+              <w:t>ஸ்</w:t>
+            </w:r>
+            <w:r>
+              <w:rPr>
+                <w:rFonts w:ascii="Latha" w:hAnsi="Latha" w:cs="Latha" w:hint="cs"/>
+                <w:sz w:val="28"/>
+                <w:szCs w:val="28"/>
+                <w:cs/>
+                <w:lang w:bidi="ta-IN"/>
+              </w:rPr>
+              <w:t>மை</w:t>
+            </w:r>
+            <w:r>
+              <w:rPr>
+                <w:rFonts w:ascii="BRH Tamil Tab Extra" w:hAnsi="BRH Tamil Tab Extra"/>
+                <w:b/>
+                <w:sz w:val="36"/>
+                <w:szCs w:val="28"/>
+              </w:rPr>
+              <w:t>†</w:t>
+            </w:r>
+            <w:r>
+              <w:rPr>
+                <w:sz w:val="28"/>
+                <w:szCs w:val="28"/>
+              </w:rPr>
+              <w:t xml:space="preserve"> </w:t>
+            </w:r>
+            <w:r>
+              <w:rPr>
+                <w:rFonts w:ascii="Latha" w:hAnsi="Latha" w:cs="Latha" w:hint="cs"/>
+                <w:sz w:val="28"/>
+                <w:szCs w:val="28"/>
+                <w:cs/>
+                <w:lang w:bidi="ta-IN"/>
+              </w:rPr>
+              <w:t>ப</w:t>
+            </w:r>
+            <w:r>
+              <w:rPr>
+                <w:rFonts w:ascii="BRH Tamil Tab Extra" w:hAnsi="BRH Tamil Tab Extra"/>
+                <w:b/>
+                <w:sz w:val="36"/>
+                <w:szCs w:val="28"/>
+              </w:rPr>
+              <w:t>…</w:t>
+            </w:r>
+            <w:r>
+              <w:rPr>
+                <w:rFonts w:ascii="Latha" w:hAnsi="Latha" w:cs="Latha" w:hint="cs"/>
+                <w:sz w:val="28"/>
+                <w:szCs w:val="28"/>
+                <w:cs/>
+                <w:lang w:bidi="ta-IN"/>
+              </w:rPr>
+              <w:t>ஶூனவ</w:t>
+            </w:r>
+            <w:r>
+              <w:rPr>
+                <w:rFonts w:ascii="BRH Tamil Tab Extra" w:hAnsi="BRH Tamil Tab Extra"/>
+                <w:b/>
+                <w:sz w:val="36"/>
+                <w:szCs w:val="28"/>
+              </w:rPr>
+              <w:t>†</w:t>
+            </w:r>
+            <w:r>
+              <w:rPr>
+                <w:sz w:val="28"/>
+                <w:szCs w:val="28"/>
+              </w:rPr>
+              <w:t xml:space="preserve"> </w:t>
+            </w:r>
+            <w:r>
+              <w:rPr>
+                <w:rFonts w:ascii="Latha" w:hAnsi="Latha" w:cs="Latha" w:hint="cs"/>
+                <w:sz w:val="28"/>
+                <w:szCs w:val="28"/>
+                <w:cs/>
+                <w:lang w:bidi="ta-IN"/>
+              </w:rPr>
+              <w:t>ருந்தே</w:t>
+            </w:r>
+            <w:r>
+              <w:rPr>
+                <w:rFonts w:ascii="Latha" w:hAnsi="Latha" w:cs="Latha" w:hint="cs"/>
+                <w:b/>
+                <w:bCs/>
+                <w:position w:val="-12"/>
+                <w:sz w:val="28"/>
+                <w:szCs w:val="28"/>
+                <w:cs/>
+                <w:lang w:bidi="ta-IN"/>
+              </w:rPr>
+              <w:t>4</w:t>
+            </w:r>
+          </w:p>
+        </w:tc>
+        <w:tc>
+          <w:tcPr>
+            <w:tcW w:w="4678" w:type="dxa"/>
+          </w:tcPr>
+          <w:p>
+            <w:pPr>
+              <w:spacing w:before="0" w:line="240" w:lineRule="auto"/>
+              <w:ind w:right="-18"/>
+              <w:rPr>
+                <w:b/>
+                <w:bCs/>
+                <w:sz w:val="32"/>
+                <w:szCs w:val="32"/>
+              </w:rPr>
+            </w:pPr>
+            <w:r>
+              <w:rPr>
+                <w:rFonts w:ascii="Latha" w:hAnsi="Latha" w:cs="Latha" w:hint="cs"/>
+                <w:sz w:val="28"/>
+                <w:szCs w:val="28"/>
+                <w:cs/>
+                <w:lang w:bidi="ta-IN"/>
+              </w:rPr>
+              <w:t>ப்</w:t>
+            </w:r>
+            <w:r>
+              <w:rPr>
+                <w:rFonts w:ascii="Latha" w:hAnsi="Latha" w:cs="Latha" w:hint="cs"/>
+                <w:b/>
+                <w:bCs/>
+                <w:position w:val="-12"/>
+                <w:sz w:val="28"/>
+                <w:szCs w:val="28"/>
+                <w:cs/>
+                <w:lang w:bidi="ta-IN"/>
+              </w:rPr>
+              <w:t>3</w:t>
+            </w:r>
+            <w:r>
+              <w:rPr>
+                <w:rFonts w:ascii="Latha" w:hAnsi="Latha" w:cs="Latha" w:hint="cs"/>
+                <w:sz w:val="28"/>
+                <w:szCs w:val="28"/>
+                <w:cs/>
+                <w:lang w:bidi="ta-IN"/>
+              </w:rPr>
+              <w:t>ரஹ்ம</w:t>
+            </w:r>
+            <w:r>
+              <w:rPr>
+                <w:rFonts w:ascii="BRH Tamil Tab Extra" w:hAnsi="BRH Tamil Tab Extra"/>
+                <w:b/>
+                <w:sz w:val="36"/>
+                <w:szCs w:val="28"/>
+              </w:rPr>
+              <w:t>†</w:t>
+            </w:r>
+            <w:r>
+              <w:rPr>
+                <w:rFonts w:ascii="Latha" w:hAnsi="Latha" w:cs="Latha" w:hint="cs"/>
+                <w:sz w:val="28"/>
+                <w:szCs w:val="28"/>
+                <w:cs/>
+                <w:lang w:bidi="ta-IN"/>
+              </w:rPr>
+              <w:t>ணை</w:t>
+            </w:r>
+            <w:r>
+              <w:rPr>
+                <w:rFonts w:ascii="BRH Tamil Tab Extra" w:hAnsi="BRH Tamil Tab Extra"/>
+                <w:b/>
+                <w:sz w:val="36"/>
+                <w:szCs w:val="28"/>
+                <w:highlight w:val="yellow"/>
+              </w:rPr>
+              <w:t>…</w:t>
+            </w:r>
+            <w:r>
+              <w:rPr>
+                <w:rFonts w:ascii="Latha" w:hAnsi="Latha" w:cs="Latha" w:hint="cs"/>
+                <w:sz w:val="28"/>
+                <w:szCs w:val="28"/>
+                <w:highlight w:val="green"/>
+                <w:cs/>
+                <w:lang w:bidi="ta-IN"/>
+              </w:rPr>
+              <w:t>வா</w:t>
+            </w:r>
+            <w:r>
+              <w:rPr>
+                <w:rFonts w:ascii="Latha" w:hAnsi="Latha" w:cs="Latha" w:hint="cs"/>
+                <w:sz w:val="28"/>
+                <w:szCs w:val="28"/>
+                <w:cs/>
+                <w:lang w:bidi="ta-IN"/>
+              </w:rPr>
+              <w:t>ஸ்மை</w:t>
+            </w:r>
+            <w:r>
+              <w:rPr>
+                <w:rFonts w:ascii="BRH Tamil Tab Extra" w:hAnsi="BRH Tamil Tab Extra"/>
+                <w:b/>
+                <w:sz w:val="36"/>
+                <w:szCs w:val="28"/>
+              </w:rPr>
+              <w:t>†</w:t>
+            </w:r>
+            <w:r>
+              <w:rPr>
+                <w:sz w:val="28"/>
+                <w:szCs w:val="28"/>
+              </w:rPr>
+              <w:t xml:space="preserve"> </w:t>
+            </w:r>
+            <w:r>
+              <w:rPr>
+                <w:rFonts w:ascii="Latha" w:hAnsi="Latha" w:cs="Latha" w:hint="cs"/>
+                <w:sz w:val="28"/>
+                <w:szCs w:val="28"/>
+                <w:cs/>
+                <w:lang w:bidi="ta-IN"/>
+              </w:rPr>
+              <w:t>ப</w:t>
+            </w:r>
+            <w:r>
+              <w:rPr>
+                <w:rFonts w:ascii="BRH Tamil Tab Extra" w:hAnsi="BRH Tamil Tab Extra"/>
+                <w:b/>
+                <w:sz w:val="36"/>
+                <w:szCs w:val="28"/>
+              </w:rPr>
+              <w:t>…</w:t>
+            </w:r>
+            <w:r>
+              <w:rPr>
+                <w:rFonts w:ascii="Latha" w:hAnsi="Latha" w:cs="Latha" w:hint="cs"/>
+                <w:sz w:val="28"/>
+                <w:szCs w:val="28"/>
+                <w:cs/>
+                <w:lang w:bidi="ta-IN"/>
+              </w:rPr>
+              <w:t>ஶூனவ</w:t>
+            </w:r>
+            <w:r>
+              <w:rPr>
+                <w:rFonts w:ascii="BRH Tamil Tab Extra" w:hAnsi="BRH Tamil Tab Extra"/>
+                <w:b/>
+                <w:sz w:val="36"/>
+                <w:szCs w:val="28"/>
+              </w:rPr>
+              <w:t>†</w:t>
+            </w:r>
+            <w:r>
+              <w:rPr>
+                <w:sz w:val="28"/>
+                <w:szCs w:val="28"/>
+              </w:rPr>
+              <w:t xml:space="preserve"> </w:t>
+            </w:r>
+            <w:r>
+              <w:rPr>
+                <w:rFonts w:ascii="Latha" w:hAnsi="Latha" w:cs="Latha" w:hint="cs"/>
+                <w:sz w:val="28"/>
+                <w:szCs w:val="28"/>
+                <w:cs/>
+                <w:lang w:bidi="ta-IN"/>
+              </w:rPr>
+              <w:t>ருந்தே</w:t>
+            </w:r>
+            <w:r>
+              <w:rPr>
+                <w:rFonts w:ascii="Latha" w:hAnsi="Latha" w:cs="Latha" w:hint="cs"/>
+                <w:b/>
+                <w:bCs/>
+                <w:position w:val="-12"/>
+                <w:sz w:val="28"/>
+                <w:szCs w:val="28"/>
+                <w:cs/>
+                <w:lang w:bidi="ta-IN"/>
+              </w:rPr>
+              <w:t>4</w:t>
+            </w:r>
+            <w:r>
+              <w:rPr>
+                <w:rFonts w:ascii="Latha" w:hAnsi="Latha" w:cs="Latha"/>
+                <w:b/>
+                <w:bCs/>
+                <w:position w:val="-12"/>
+                <w:sz w:val="28"/>
+                <w:szCs w:val="28"/>
+                <w:lang w:bidi="ta-IN"/>
+              </w:rPr>
+              <w:t xml:space="preserve"> </w:t>
+            </w:r>
+            <w:r>
+              <w:rPr>
+                <w:rFonts w:ascii="Latha" w:hAnsi="Latha" w:cs="Latha"/>
+                <w:b/>
+                <w:bCs/>
+                <w:position w:val="-12"/>
+                <w:sz w:val="28"/>
+                <w:szCs w:val="28"/>
+                <w:lang w:bidi="ta-IN"/>
+              </w:rPr>
+              <w:br/>
+            </w:r>
+            <w:r>
+              <w:rPr>
+                <w:rFonts w:ascii="Latha" w:hAnsi="Latha" w:cs="Latha"/>
+                <w:b/>
+                <w:bCs/>
+                <w:position w:val="-12"/>
+                <w:sz w:val="28"/>
+                <w:szCs w:val="28"/>
+                <w:lang w:bidi="ta-IN"/>
+              </w:rPr>
+              <w:t>(deletion of</w:t>
+            </w:r>
+            <w:r>
+              <w:rPr>
+                <w:rFonts w:ascii="Latha" w:hAnsi="Latha" w:cs="Latha"/>
+                <w:b/>
+                <w:bCs/>
+                <w:position w:val="-12"/>
+                <w:sz w:val="28"/>
+                <w:szCs w:val="28"/>
+                <w:lang w:bidi="ta-IN"/>
+              </w:rPr>
+              <w:t xml:space="preserve"> </w:t>
+            </w:r>
+            <w:r>
+              <w:rPr>
+                <w:rFonts w:ascii="Latha" w:hAnsi="Latha" w:cs="Latha" w:hint="cs"/>
+                <w:sz w:val="28"/>
+                <w:szCs w:val="28"/>
+                <w:highlight w:val="green"/>
+                <w:cs/>
+                <w:lang w:bidi="ta-IN"/>
+              </w:rPr>
+              <w:t>வா</w:t>
+            </w:r>
+            <w:r>
+              <w:rPr>
+                <w:rFonts w:ascii="Latha" w:hAnsi="Latha" w:cs="Latha"/>
+                <w:b/>
+                <w:bCs/>
+                <w:position w:val="-12"/>
+                <w:sz w:val="28"/>
+                <w:szCs w:val="28"/>
+                <w:lang w:bidi="ta-IN"/>
+              </w:rPr>
+              <w:t xml:space="preserve"> now added)</w:t>
             </w:r>
           </w:p>
         </w:tc>
@@ -1739,7 +2405,29 @@
                 <w:sz w:val="28"/>
                 <w:szCs w:val="28"/>
               </w:rPr>
-              <w:t>TS 6.1.10.2  - Vaakyam</w:t>
+              <w:t xml:space="preserve">TS </w:t>
+            </w:r>
+            <w:proofErr w:type="gramStart"/>
+            <w:r>
+              <w:rPr>
+                <w:rFonts w:cs="Arial"/>
+                <w:b/>
+                <w:bCs/>
+                <w:sz w:val="28"/>
+                <w:szCs w:val="28"/>
+              </w:rPr>
+              <w:t>6.1.10.2  -</w:t>
+            </w:r>
+            <w:proofErr w:type="gramEnd"/>
+            <w:r>
+              <w:rPr>
+                <w:rFonts w:cs="Arial"/>
+                <w:b/>
+                <w:bCs/>
+                <w:sz w:val="28"/>
+                <w:szCs w:val="28"/>
+              </w:rPr>
+              <w:t xml:space="preserve"> Vaakyam</w:t>
             </w:r>
           </w:p>
           <w:p>
@@ -2102,586 +2790,6 @@
                 <w:lang w:bidi="ta-IN"/>
               </w:rPr>
               <w:t>ய</w:t>
-            </w:r>
-          </w:p>
-        </w:tc>
-      </w:tr>
-      <w:tr>
-        <w:tc>
-          <w:tcPr>
-            <w:tcW w:w="3658" w:type="dxa"/>
-          </w:tcPr>
-          <w:p>
-            <w:pPr>
-              <w:widowControl w:val="0"/>
-              <w:autoSpaceDE w:val="0"/>
-              <w:autoSpaceDN w:val="0"/>
-              <w:adjustRightInd w:val="0"/>
-              <w:spacing w:before="0"/>
-              <w:rPr>
-                <w:rFonts w:cs="Arial"/>
-                <w:b/>
-                <w:bCs/>
-                <w:sz w:val="28"/>
-                <w:szCs w:val="28"/>
-              </w:rPr>
-            </w:pPr>
-            <w:r>
-              <w:rPr>
-                <w:rFonts w:cs="Arial"/>
-                <w:b/>
-                <w:bCs/>
-                <w:sz w:val="28"/>
-                <w:szCs w:val="28"/>
-              </w:rPr>
-              <w:t>TS 6.</w:t>
-            </w:r>
-            <w:r>
-              <w:rPr>
-                <w:rFonts w:cs="Arial"/>
-                <w:b/>
-                <w:bCs/>
-                <w:sz w:val="28"/>
-                <w:szCs w:val="28"/>
-              </w:rPr>
-              <w:t>1</w:t>
-            </w:r>
-            <w:r>
-              <w:rPr>
-                <w:rFonts w:cs="Arial"/>
-                <w:b/>
-                <w:bCs/>
-                <w:sz w:val="28"/>
-                <w:szCs w:val="28"/>
-              </w:rPr>
-              <w:t>.</w:t>
-            </w:r>
-            <w:r>
-              <w:rPr>
-                <w:rFonts w:cs="Arial"/>
-                <w:b/>
-                <w:bCs/>
-                <w:sz w:val="28"/>
-                <w:szCs w:val="28"/>
-              </w:rPr>
-              <w:t>8.2</w:t>
-            </w:r>
-            <w:r>
-              <w:rPr>
-                <w:rFonts w:cs="Arial"/>
-                <w:b/>
-                <w:bCs/>
-                <w:sz w:val="28"/>
-                <w:szCs w:val="28"/>
-              </w:rPr>
-              <w:t xml:space="preserve"> - Vaakyam</w:t>
-            </w:r>
-          </w:p>
-          <w:p>
-            <w:pPr>
-              <w:widowControl w:val="0"/>
-              <w:autoSpaceDE w:val="0"/>
-              <w:autoSpaceDN w:val="0"/>
-              <w:adjustRightInd w:val="0"/>
-              <w:spacing w:before="0"/>
-              <w:rPr>
-                <w:rFonts w:cs="Arial"/>
-                <w:b/>
-                <w:bCs/>
-                <w:sz w:val="28"/>
-                <w:szCs w:val="28"/>
-              </w:rPr>
-            </w:pPr>
-            <w:r>
-              <w:rPr>
-                <w:rFonts w:cs="Arial"/>
-                <w:b/>
-                <w:bCs/>
-                <w:sz w:val="28"/>
-                <w:szCs w:val="28"/>
-              </w:rPr>
-              <w:t xml:space="preserve">Line No. </w:t>
-            </w:r>
-            <w:r>
-              <w:rPr>
-                <w:rFonts w:cs="Arial"/>
-                <w:b/>
-                <w:bCs/>
-                <w:sz w:val="28"/>
-                <w:szCs w:val="28"/>
-              </w:rPr>
-              <w:t>- 3</w:t>
-            </w:r>
-          </w:p>
-          <w:p>
-            <w:pPr>
-              <w:spacing w:before="0" w:line="240" w:lineRule="auto"/>
-              <w:rPr>
-                <w:b/>
-                <w:bCs/>
-                <w:sz w:val="32"/>
-                <w:szCs w:val="32"/>
-              </w:rPr>
-            </w:pPr>
-            <w:r>
-              <w:rPr>
-                <w:rFonts w:cs="Arial"/>
-                <w:b/>
-                <w:bCs/>
-                <w:sz w:val="28"/>
-                <w:szCs w:val="28"/>
-              </w:rPr>
-              <w:t xml:space="preserve">Panchaati No. </w:t>
-            </w:r>
-            <w:r>
-              <w:rPr>
-                <w:rFonts w:cs="Arial"/>
-                <w:b/>
-                <w:bCs/>
-                <w:sz w:val="28"/>
-                <w:szCs w:val="28"/>
-              </w:rPr>
-              <w:t>- 55</w:t>
-            </w:r>
-          </w:p>
-        </w:tc>
-        <w:tc>
-          <w:tcPr>
-            <w:tcW w:w="4706" w:type="dxa"/>
-            <w:gridSpan w:val="2"/>
-          </w:tcPr>
-          <w:p>
-            <w:pPr>
-              <w:spacing w:before="0" w:line="240" w:lineRule="auto"/>
-              <w:rPr>
-                <w:b/>
-                <w:bCs/>
-                <w:sz w:val="32"/>
-                <w:szCs w:val="32"/>
-              </w:rPr>
-            </w:pPr>
-            <w:r>
-              <w:rPr>
-                <w:rFonts w:ascii="Latha" w:hAnsi="Latha" w:cs="Latha" w:hint="cs"/>
-                <w:sz w:val="28"/>
-                <w:szCs w:val="28"/>
-                <w:cs/>
-                <w:lang w:bidi="ta-IN"/>
-              </w:rPr>
-              <w:t>ப்</w:t>
-            </w:r>
-            <w:r>
-              <w:rPr>
-                <w:rFonts w:ascii="Latha" w:hAnsi="Latha" w:cs="Latha" w:hint="cs"/>
-                <w:b/>
-                <w:bCs/>
-                <w:position w:val="-12"/>
-                <w:sz w:val="28"/>
-                <w:szCs w:val="28"/>
-                <w:cs/>
-                <w:lang w:bidi="ta-IN"/>
-              </w:rPr>
-              <w:t>3</w:t>
-            </w:r>
-            <w:r>
-              <w:rPr>
-                <w:rFonts w:ascii="Latha" w:hAnsi="Latha" w:cs="Latha" w:hint="cs"/>
-                <w:sz w:val="28"/>
-                <w:szCs w:val="28"/>
-                <w:cs/>
-                <w:lang w:bidi="ta-IN"/>
-              </w:rPr>
-              <w:t>ரஹ்ம</w:t>
-            </w:r>
-            <w:r>
-              <w:rPr>
-                <w:rFonts w:ascii="BRH Tamil Tab Extra" w:hAnsi="BRH Tamil Tab Extra"/>
-                <w:b/>
-                <w:sz w:val="36"/>
-                <w:szCs w:val="28"/>
-              </w:rPr>
-              <w:t>†</w:t>
-            </w:r>
-            <w:r>
-              <w:rPr>
-                <w:rFonts w:ascii="Latha" w:hAnsi="Latha" w:cs="Latha" w:hint="cs"/>
-                <w:sz w:val="28"/>
-                <w:szCs w:val="28"/>
-                <w:highlight w:val="yellow"/>
-                <w:cs/>
-                <w:lang w:bidi="ta-IN"/>
-              </w:rPr>
-              <w:t>ணை</w:t>
-            </w:r>
-            <w:r>
-              <w:rPr>
-                <w:rFonts w:ascii="BRH Tamil Tab Extra" w:hAnsi="BRH Tamil Tab Extra"/>
-                <w:b/>
-                <w:sz w:val="36"/>
-                <w:szCs w:val="28"/>
-                <w:highlight w:val="yellow"/>
-              </w:rPr>
-              <w:t>…</w:t>
-            </w:r>
-            <w:r>
-              <w:rPr>
-                <w:rFonts w:ascii="Latha" w:hAnsi="Latha" w:cs="Latha" w:hint="cs"/>
-                <w:sz w:val="28"/>
-                <w:szCs w:val="28"/>
-                <w:highlight w:val="yellow"/>
-                <w:cs/>
-                <w:lang w:bidi="ta-IN"/>
-              </w:rPr>
-              <w:t>ஸ்</w:t>
-            </w:r>
-            <w:r>
-              <w:rPr>
-                <w:rFonts w:ascii="Latha" w:hAnsi="Latha" w:cs="Latha" w:hint="cs"/>
-                <w:sz w:val="28"/>
-                <w:szCs w:val="28"/>
-                <w:cs/>
-                <w:lang w:bidi="ta-IN"/>
-              </w:rPr>
-              <w:t>மை</w:t>
-            </w:r>
-            <w:r>
-              <w:rPr>
-                <w:rFonts w:ascii="BRH Tamil Tab Extra" w:hAnsi="BRH Tamil Tab Extra"/>
-                <w:b/>
-                <w:sz w:val="36"/>
-                <w:szCs w:val="28"/>
-              </w:rPr>
-              <w:t>†</w:t>
-            </w:r>
-            <w:r>
-              <w:rPr>
-                <w:sz w:val="28"/>
-                <w:szCs w:val="28"/>
-              </w:rPr>
-              <w:t xml:space="preserve"> </w:t>
-            </w:r>
-            <w:r>
-              <w:rPr>
-                <w:rFonts w:ascii="Latha" w:hAnsi="Latha" w:cs="Latha" w:hint="cs"/>
-                <w:sz w:val="28"/>
-                <w:szCs w:val="28"/>
-                <w:cs/>
-                <w:lang w:bidi="ta-IN"/>
-              </w:rPr>
-              <w:t>ப</w:t>
-            </w:r>
-            <w:r>
-              <w:rPr>
-                <w:rFonts w:ascii="BRH Tamil Tab Extra" w:hAnsi="BRH Tamil Tab Extra"/>
-                <w:b/>
-                <w:sz w:val="36"/>
-                <w:szCs w:val="28"/>
-              </w:rPr>
-              <w:t>…</w:t>
-            </w:r>
-            <w:r>
-              <w:rPr>
-                <w:rFonts w:ascii="Latha" w:hAnsi="Latha" w:cs="Latha" w:hint="cs"/>
-                <w:sz w:val="28"/>
-                <w:szCs w:val="28"/>
-                <w:cs/>
-                <w:lang w:bidi="ta-IN"/>
-              </w:rPr>
-              <w:t>ஶூனவ</w:t>
-            </w:r>
-            <w:r>
-              <w:rPr>
-                <w:rFonts w:ascii="BRH Tamil Tab Extra" w:hAnsi="BRH Tamil Tab Extra"/>
-                <w:b/>
-                <w:sz w:val="36"/>
-                <w:szCs w:val="28"/>
-              </w:rPr>
-              <w:t>†</w:t>
-            </w:r>
-            <w:r>
-              <w:rPr>
-                <w:sz w:val="28"/>
-                <w:szCs w:val="28"/>
-              </w:rPr>
-              <w:t xml:space="preserve"> </w:t>
-            </w:r>
-            <w:r>
-              <w:rPr>
-                <w:rFonts w:ascii="Latha" w:hAnsi="Latha" w:cs="Latha" w:hint="cs"/>
-                <w:sz w:val="28"/>
-                <w:szCs w:val="28"/>
-                <w:cs/>
-                <w:lang w:bidi="ta-IN"/>
-              </w:rPr>
-              <w:t>ருந்தே</w:t>
-            </w:r>
-            <w:r>
-              <w:rPr>
-                <w:rFonts w:ascii="Latha" w:hAnsi="Latha" w:cs="Latha" w:hint="cs"/>
-                <w:b/>
-                <w:bCs/>
-                <w:position w:val="-12"/>
-                <w:sz w:val="28"/>
-                <w:szCs w:val="28"/>
-                <w:cs/>
-                <w:lang w:bidi="ta-IN"/>
-              </w:rPr>
-              <w:t>4</w:t>
-            </w:r>
-          </w:p>
-        </w:tc>
-        <w:tc>
-          <w:tcPr>
-            <w:tcW w:w="4678" w:type="dxa"/>
-          </w:tcPr>
-          <w:p>
-            <w:pPr>
-              <w:spacing w:before="0" w:line="240" w:lineRule="auto"/>
-              <w:ind w:right="-18"/>
-              <w:rPr>
-                <w:b/>
-                <w:bCs/>
-                <w:sz w:val="32"/>
-                <w:szCs w:val="32"/>
-              </w:rPr>
-            </w:pPr>
-            <w:r>
-              <w:rPr>
-                <w:rFonts w:ascii="Latha" w:hAnsi="Latha" w:cs="Latha" w:hint="cs"/>
-                <w:sz w:val="28"/>
-                <w:szCs w:val="28"/>
-                <w:cs/>
-                <w:lang w:bidi="ta-IN"/>
-              </w:rPr>
-              <w:t>ப்</w:t>
-            </w:r>
-            <w:r>
-              <w:rPr>
-                <w:rFonts w:ascii="Latha" w:hAnsi="Latha" w:cs="Latha" w:hint="cs"/>
-                <w:b/>
-                <w:bCs/>
-                <w:position w:val="-12"/>
-                <w:sz w:val="28"/>
-                <w:szCs w:val="28"/>
-                <w:cs/>
-                <w:lang w:bidi="ta-IN"/>
-              </w:rPr>
-              <w:t>3</w:t>
-            </w:r>
-            <w:r>
-              <w:rPr>
-                <w:rFonts w:ascii="Latha" w:hAnsi="Latha" w:cs="Latha" w:hint="cs"/>
-                <w:sz w:val="28"/>
-                <w:szCs w:val="28"/>
-                <w:cs/>
-                <w:lang w:bidi="ta-IN"/>
-              </w:rPr>
-              <w:t>ரஹ்ம</w:t>
-            </w:r>
-            <w:r>
-              <w:rPr>
-                <w:rFonts w:ascii="BRH Tamil Tab Extra" w:hAnsi="BRH Tamil Tab Extra"/>
-                <w:b/>
-                <w:sz w:val="36"/>
-                <w:szCs w:val="28"/>
-              </w:rPr>
-              <w:t>†</w:t>
-            </w:r>
-            <w:r>
-              <w:rPr>
-                <w:rFonts w:ascii="Latha" w:hAnsi="Latha" w:cs="Latha" w:hint="cs"/>
-                <w:sz w:val="28"/>
-                <w:szCs w:val="28"/>
-                <w:cs/>
-                <w:lang w:bidi="ta-IN"/>
-              </w:rPr>
-              <w:t>ணை</w:t>
-            </w:r>
-            <w:r>
-              <w:rPr>
-                <w:rFonts w:ascii="BRH Tamil Tab Extra" w:hAnsi="BRH Tamil Tab Extra"/>
-                <w:b/>
-                <w:sz w:val="36"/>
-                <w:szCs w:val="28"/>
-                <w:highlight w:val="yellow"/>
-              </w:rPr>
-              <w:t>…</w:t>
-            </w:r>
-            <w:r>
-              <w:rPr>
-                <w:rFonts w:ascii="Latha" w:hAnsi="Latha" w:cs="Latha" w:hint="cs"/>
-                <w:sz w:val="28"/>
-                <w:szCs w:val="28"/>
-                <w:highlight w:val="green"/>
-                <w:cs/>
-                <w:lang w:bidi="ta-IN"/>
-              </w:rPr>
-              <w:t>வா</w:t>
-            </w:r>
-            <w:r>
-              <w:rPr>
-                <w:rFonts w:ascii="Latha" w:hAnsi="Latha" w:cs="Latha" w:hint="cs"/>
-                <w:sz w:val="28"/>
-                <w:szCs w:val="28"/>
-                <w:cs/>
-                <w:lang w:bidi="ta-IN"/>
-              </w:rPr>
-              <w:t>ஸ்மை</w:t>
-            </w:r>
-            <w:r>
-              <w:rPr>
-                <w:rFonts w:ascii="BRH Tamil Tab Extra" w:hAnsi="BRH Tamil Tab Extra"/>
-                <w:b/>
-                <w:sz w:val="36"/>
-                <w:szCs w:val="28"/>
-              </w:rPr>
-              <w:t>†</w:t>
-            </w:r>
-            <w:r>
-              <w:rPr>
-                <w:sz w:val="28"/>
-                <w:szCs w:val="28"/>
-              </w:rPr>
-              <w:t xml:space="preserve"> </w:t>
-            </w:r>
-            <w:r>
-              <w:rPr>
-                <w:rFonts w:ascii="Latha" w:hAnsi="Latha" w:cs="Latha" w:hint="cs"/>
-                <w:sz w:val="28"/>
-                <w:szCs w:val="28"/>
-                <w:cs/>
-                <w:lang w:bidi="ta-IN"/>
-              </w:rPr>
-              <w:t>ப</w:t>
-            </w:r>
-            <w:r>
-              <w:rPr>
-                <w:rFonts w:ascii="BRH Tamil Tab Extra" w:hAnsi="BRH Tamil Tab Extra"/>
-                <w:b/>
-                <w:sz w:val="36"/>
-                <w:szCs w:val="28"/>
-              </w:rPr>
-              <w:t>…</w:t>
-            </w:r>
-            <w:r>
-              <w:rPr>
-                <w:rFonts w:ascii="Latha" w:hAnsi="Latha" w:cs="Latha" w:hint="cs"/>
-                <w:sz w:val="28"/>
-                <w:szCs w:val="28"/>
-                <w:cs/>
-                <w:lang w:bidi="ta-IN"/>
-              </w:rPr>
-              <w:t>ஶூனவ</w:t>
-            </w:r>
-            <w:r>
-              <w:rPr>
-                <w:rFonts w:ascii="BRH Tamil Tab Extra" w:hAnsi="BRH Tamil Tab Extra"/>
-                <w:b/>
-                <w:sz w:val="36"/>
-                <w:szCs w:val="28"/>
-              </w:rPr>
-              <w:t>†</w:t>
-            </w:r>
-            <w:r>
-              <w:rPr>
-                <w:sz w:val="28"/>
-                <w:szCs w:val="28"/>
-              </w:rPr>
-              <w:t xml:space="preserve"> </w:t>
-            </w:r>
-            <w:r>
-              <w:rPr>
-                <w:rFonts w:ascii="Latha" w:hAnsi="Latha" w:cs="Latha" w:hint="cs"/>
-                <w:sz w:val="28"/>
-                <w:szCs w:val="28"/>
-                <w:cs/>
-                <w:lang w:bidi="ta-IN"/>
-              </w:rPr>
-              <w:t>ருந்தே</w:t>
-            </w:r>
-            <w:r>
-              <w:rPr>
-                <w:rFonts w:ascii="Latha" w:hAnsi="Latha" w:cs="Latha" w:hint="cs"/>
-                <w:b/>
-                <w:bCs/>
-                <w:position w:val="-12"/>
-                <w:sz w:val="28"/>
-                <w:szCs w:val="28"/>
-                <w:cs/>
-                <w:lang w:bidi="ta-IN"/>
-              </w:rPr>
-              <w:t>4</w:t>
-            </w:r>
-            <w:r>
-              <w:rPr>
-                <w:rFonts w:ascii="Latha" w:hAnsi="Latha" w:cs="Latha"/>
-                <w:b/>
-                <w:bCs/>
-                <w:position w:val="-12"/>
-                <w:sz w:val="28"/>
-                <w:szCs w:val="28"/>
-                <w:lang w:bidi="ta-IN"/>
-              </w:rPr>
-              <w:t xml:space="preserve"> </w:t>
-            </w:r>
-            <w:r>
-              <w:rPr>
-                <w:rFonts w:ascii="Latha" w:hAnsi="Latha" w:cs="Latha"/>
-                <w:b/>
-                <w:bCs/>
-                <w:position w:val="-12"/>
-                <w:sz w:val="28"/>
-                <w:szCs w:val="28"/>
-                <w:lang w:bidi="ta-IN"/>
-              </w:rPr>
-              <w:br/>
-            </w:r>
-            <w:r>
-              <w:rPr>
-                <w:rFonts w:ascii="Latha" w:hAnsi="Latha" w:cs="Latha"/>
-                <w:b/>
-                <w:bCs/>
-                <w:position w:val="-12"/>
-                <w:sz w:val="28"/>
-                <w:szCs w:val="28"/>
-                <w:lang w:bidi="ta-IN"/>
-              </w:rPr>
-              <w:t>(deletion of</w:t>
-            </w:r>
-            <w:r>
-              <w:rPr>
-                <w:rFonts w:ascii="Latha" w:hAnsi="Latha" w:cs="Latha"/>
-                <w:b/>
-                <w:bCs/>
-                <w:position w:val="-12"/>
-                <w:sz w:val="28"/>
-                <w:szCs w:val="28"/>
-                <w:lang w:bidi="ta-IN"/>
-              </w:rPr>
-              <w:t xml:space="preserve"> </w:t>
-            </w:r>
-            <w:r>
-              <w:rPr>
-                <w:rFonts w:ascii="Latha" w:hAnsi="Latha" w:cs="Latha" w:hint="cs"/>
-                <w:sz w:val="28"/>
-                <w:szCs w:val="28"/>
-                <w:highlight w:val="green"/>
-                <w:cs/>
-                <w:lang w:bidi="ta-IN"/>
-              </w:rPr>
-              <w:t>வா</w:t>
-            </w:r>
-            <w:r>
-              <w:rPr>
-                <w:rFonts w:ascii="Latha" w:hAnsi="Latha" w:cs="Latha"/>
-                <w:b/>
-                <w:bCs/>
-                <w:position w:val="-12"/>
-                <w:sz w:val="28"/>
-                <w:szCs w:val="28"/>
-                <w:lang w:bidi="ta-IN"/>
-              </w:rPr>
-              <w:t xml:space="preserve"> now added)</w:t>
             </w:r>
           </w:p>
         </w:tc>
@@ -2971,7 +3079,30 @@
                 <w:b/>
                 <w:bCs/>
               </w:rPr>
-              <w:t>“sra”</w:t>
+              <w:t>“</w:t>
+            </w:r>
+            <w:proofErr w:type="spellStart"/>
+            <w:r>
+              <w:rPr>
+                <w:b/>
+                <w:bCs/>
+              </w:rPr>
+              <w:t>sr</w:t>
+            </w:r>
+            <w:r>
+              <w:rPr>
+                <w:b/>
+                <w:bCs/>
+              </w:rPr>
+              <w:t>o</w:t>
+            </w:r>
+            <w:proofErr w:type="spellEnd"/>
+            <w:r>
+              <w:rPr>
+                <w:b/>
+                <w:bCs/>
+              </w:rPr>
+              <w:t>”</w:t>
             </w:r>
             <w:r>
               <w:rPr>
@@ -3016,7 +3147,18 @@
                 <w:sz w:val="28"/>
                 <w:szCs w:val="28"/>
               </w:rPr>
-              <w:t>TS 6.</w:t>
+              <w:t xml:space="preserve">TS </w:t>
+            </w:r>
+            <w:proofErr w:type="gramStart"/>
+            <w:r>
+              <w:rPr>
+                <w:rFonts w:cs="Arial"/>
+                <w:b/>
+                <w:bCs/>
+                <w:sz w:val="28"/>
+                <w:szCs w:val="28"/>
+              </w:rPr>
+              <w:t>6.</w:t>
             </w:r>
             <w:r>
               <w:rPr>
@@ -3036,7 +3178,18 @@
                 <w:sz w:val="28"/>
                 <w:szCs w:val="28"/>
               </w:rPr>
-              <w:t xml:space="preserve"> - </w:t>
+              <w:t xml:space="preserve"> -</w:t>
+            </w:r>
+            <w:proofErr w:type="gramEnd"/>
+            <w:r>
+              <w:rPr>
+                <w:rFonts w:cs="Arial"/>
+                <w:b/>
+                <w:bCs/>
+                <w:sz w:val="28"/>
+                <w:szCs w:val="28"/>
+              </w:rPr>
+              <w:t xml:space="preserve"> </w:t>
             </w:r>
             <w:r>
               <w:rPr>
@@ -4358,7 +4511,7 @@
                 <w:b/>
                 <w:sz w:val="36"/>
                 <w:szCs w:val="28"/>
-                <w:highlight w:val="green"/>
+                <w:highlight w:val="yellow"/>
               </w:rPr>
               <w:t>†</w:t>
             </w:r>
@@ -5440,6 +5593,7 @@
               </w:rPr>
               <w:t xml:space="preserve"> - </w:t>
             </w:r>
+            <w:proofErr w:type="spellStart"/>
             <w:r>
               <w:rPr>
                 <w:rFonts w:cs="Arial"/>
@@ -5450,6 +5604,7 @@
               </w:rPr>
               <w:t>vaakyam</w:t>
             </w:r>
+            <w:proofErr w:type="spellEnd"/>
           </w:p>
           <w:p>
             <w:pPr>
@@ -5909,6 +6064,7 @@
               </w:rPr>
               <w:t xml:space="preserve"> - </w:t>
             </w:r>
+            <w:proofErr w:type="spellStart"/>
             <w:r>
               <w:rPr>
                 <w:rFonts w:cs="Arial"/>
@@ -5919,6 +6075,7 @@
               </w:rPr>
               <w:t>vaakyam</w:t>
             </w:r>
+            <w:proofErr w:type="spellEnd"/>
           </w:p>
           <w:p>
             <w:pPr>
@@ -6264,86 +6421,6 @@
               </w:rPr>
               <w:t xml:space="preserve">-  </w:t>
             </w:r>
-          </w:p>
-        </w:tc>
-      </w:tr>
-      <w:tr>
-        <w:trPr>
-          <w:trHeight w:val="964"/>
-        </w:trPr>
-        <w:tc>
-          <w:tcPr>
-            <w:tcW w:w="3658" w:type="dxa"/>
-            <w:gridSpan w:val="2"/>
-            <w:tcBorders>
-              <w:top w:val="single" w:sz="4" w:space="0" w:color="000000"/>
-              <w:left w:val="single" w:sz="4" w:space="0" w:color="000000"/>
-              <w:bottom w:val="single" w:sz="4" w:space="0" w:color="000000"/>
-              <w:right w:val="single" w:sz="4" w:space="0" w:color="000000"/>
-            </w:tcBorders>
-          </w:tcPr>
-          <w:p>
-            <w:pPr>
-              <w:widowControl w:val="0"/>
-              <w:autoSpaceDE w:val="0"/>
-              <w:autoSpaceDN w:val="0"/>
-              <w:adjustRightInd w:val="0"/>
-              <w:spacing w:before="0" w:line="240" w:lineRule="auto"/>
-              <w:rPr>
-                <w:rFonts w:cs="Arial"/>
-                <w:b/>
-                <w:bCs/>
-                <w:sz w:val="28"/>
-                <w:szCs w:val="28"/>
-              </w:rPr>
-            </w:pPr>
-          </w:p>
-        </w:tc>
-        <w:tc>
-          <w:tcPr>
-            <w:tcW w:w="4656" w:type="dxa"/>
-            <w:tcBorders>
-              <w:top w:val="single" w:sz="4" w:space="0" w:color="000000"/>
-              <w:left w:val="single" w:sz="4" w:space="0" w:color="000000"/>
-              <w:bottom w:val="single" w:sz="4" w:space="0" w:color="000000"/>
-              <w:right w:val="single" w:sz="4" w:space="0" w:color="000000"/>
-            </w:tcBorders>
-          </w:tcPr>
-          <w:p>
-            <w:pPr>
-              <w:spacing w:before="0" w:line="240" w:lineRule="auto"/>
-              <w:ind w:right="-108"/>
-              <w:rPr>
-                <w:rFonts w:ascii="Latha" w:hAnsi="Latha" w:cs="Latha"/>
-                <w:sz w:val="28"/>
-                <w:szCs w:val="28"/>
-                <w:cs/>
-                <w:lang w:bidi="ta-IN"/>
-              </w:rPr>
-            </w:pPr>
-          </w:p>
-        </w:tc>
-        <w:tc>
-          <w:tcPr>
-            <w:tcW w:w="4728" w:type="dxa"/>
-            <w:tcBorders>
-              <w:top w:val="single" w:sz="4" w:space="0" w:color="000000"/>
-              <w:left w:val="single" w:sz="4" w:space="0" w:color="000000"/>
-              <w:bottom w:val="single" w:sz="4" w:space="0" w:color="000000"/>
-              <w:right w:val="single" w:sz="4" w:space="0" w:color="000000"/>
-            </w:tcBorders>
-          </w:tcPr>
-          <w:p>
-            <w:pPr>
-              <w:spacing w:before="0" w:line="240" w:lineRule="auto"/>
-              <w:rPr>
-                <w:rFonts w:ascii="Latha" w:hAnsi="Latha" w:cs="Latha"/>
-                <w:sz w:val="28"/>
-                <w:szCs w:val="28"/>
-                <w:cs/>
-                <w:lang w:bidi="ta-IN"/>
-              </w:rPr>
-            </w:pPr>
           </w:p>
         </w:tc>
       </w:tr>
@@ -6621,7 +6698,29 @@
                 <w:sz w:val="28"/>
                 <w:szCs w:val="28"/>
               </w:rPr>
-              <w:t>TS 6.1.3.8  - Vaakyam</w:t>
+              <w:t xml:space="preserve">TS </w:t>
+            </w:r>
+            <w:proofErr w:type="gramStart"/>
+            <w:r>
+              <w:rPr>
+                <w:rFonts w:cs="Arial"/>
+                <w:b/>
+                <w:bCs/>
+                <w:sz w:val="28"/>
+                <w:szCs w:val="28"/>
+              </w:rPr>
+              <w:t>6.1.3.8  -</w:t>
+            </w:r>
+            <w:proofErr w:type="gramEnd"/>
+            <w:r>
+              <w:rPr>
+                <w:rFonts w:cs="Arial"/>
+                <w:b/>
+                <w:bCs/>
+                <w:sz w:val="28"/>
+                <w:szCs w:val="28"/>
+              </w:rPr>
+              <w:t xml:space="preserve"> Vaakyam</w:t>
             </w:r>
           </w:p>
           <w:p>
@@ -7454,7 +7553,18 @@
                 <w:sz w:val="28"/>
                 <w:szCs w:val="28"/>
               </w:rPr>
-              <w:t>(it is hra</w:t>
+              <w:t xml:space="preserve">(it is </w:t>
+            </w:r>
+            <w:proofErr w:type="spellStart"/>
+            <w:r>
+              <w:rPr>
+                <w:rFonts w:cs="Arial"/>
+                <w:b/>
+                <w:bCs/>
+                <w:sz w:val="28"/>
+                <w:szCs w:val="28"/>
+              </w:rPr>
+              <w:t>hra</w:t>
             </w:r>
             <w:r>
               <w:rPr>
@@ -7474,7 +7584,18 @@
                 <w:sz w:val="28"/>
                 <w:szCs w:val="28"/>
               </w:rPr>
-              <w:t>vam)</w:t>
+              <w:t>vam</w:t>
+            </w:r>
+            <w:proofErr w:type="spellEnd"/>
+            <w:r>
+              <w:rPr>
+                <w:rFonts w:cs="Arial"/>
+                <w:b/>
+                <w:bCs/>
+                <w:sz w:val="28"/>
+                <w:szCs w:val="28"/>
+              </w:rPr>
+              <w:t>)</w:t>
             </w:r>
           </w:p>
         </w:tc>
@@ -8523,7 +8644,6 @@
                 <w:sz w:val="28"/>
                 <w:szCs w:val="28"/>
               </w:rPr>
-              <w:lastRenderedPageBreak/>
               <w:t>TS 6.</w:t>
             </w:r>
             <w:r>
@@ -8609,16 +8729,6 @@
               </w:rPr>
               <w:t>Last line</w:t>
             </w:r>
-          </w:p>
-          <w:p>
-            <w:pPr>
-              <w:spacing w:before="0" w:line="240" w:lineRule="auto"/>
-              <w:rPr>
-                <w:b/>
-                <w:sz w:val="28"/>
-                <w:szCs w:val="28"/>
-              </w:rPr>
-            </w:pPr>
           </w:p>
         </w:tc>
         <w:tc>
@@ -9001,7 +9111,30 @@
                 <w:sz w:val="28"/>
                 <w:szCs w:val="28"/>
               </w:rPr>
-              <w:t>TS 6.1.10.3  - Vaakyam</w:t>
+              <w:lastRenderedPageBreak/>
+              <w:t xml:space="preserve">TS </w:t>
+            </w:r>
+            <w:proofErr w:type="gramStart"/>
+            <w:r>
+              <w:rPr>
+                <w:rFonts w:cs="Arial"/>
+                <w:b/>
+                <w:bCs/>
+                <w:sz w:val="28"/>
+                <w:szCs w:val="28"/>
+              </w:rPr>
+              <w:t>6.1.10.3  -</w:t>
+            </w:r>
+            <w:proofErr w:type="gramEnd"/>
+            <w:r>
+              <w:rPr>
+                <w:rFonts w:cs="Arial"/>
+                <w:b/>
+                <w:bCs/>
+                <w:sz w:val="28"/>
+                <w:szCs w:val="28"/>
+              </w:rPr>
+              <w:t xml:space="preserve"> Vaakyam</w:t>
             </w:r>
           </w:p>
           <w:p>
@@ -9438,7 +9571,25 @@
                 <w:sz w:val="28"/>
                 <w:szCs w:val="40"/>
               </w:rPr>
-              <w:t>(swaritam removed)</w:t>
+              <w:t>(</w:t>
+            </w:r>
+            <w:proofErr w:type="spellStart"/>
+            <w:r>
+              <w:rPr>
+                <w:rFonts w:cs="Arial"/>
+                <w:sz w:val="28"/>
+                <w:szCs w:val="40"/>
+              </w:rPr>
+              <w:t>swaritam</w:t>
+            </w:r>
+            <w:proofErr w:type="spellEnd"/>
+            <w:r>
+              <w:rPr>
+                <w:rFonts w:cs="Arial"/>
+                <w:sz w:val="28"/>
+                <w:szCs w:val="40"/>
+              </w:rPr>
+              <w:t xml:space="preserve"> removed)</w:t>
             </w:r>
           </w:p>
         </w:tc>
@@ -10997,13 +11148,23 @@
               </w:rPr>
               <w:t>ஞ்சோ</w:t>
             </w:r>
-            <w:r>
-              <w:rPr>
-                <w:rFonts w:ascii="Latha" w:hAnsi="Latha" w:cs="Latha"/>
-                <w:sz w:val="28"/>
-                <w:szCs w:val="28"/>
-              </w:rPr>
-              <w:t xml:space="preserve">-  [  ]  </w:t>
+            <w:proofErr w:type="gramStart"/>
+            <w:r>
+              <w:rPr>
+                <w:rFonts w:ascii="Latha" w:hAnsi="Latha" w:cs="Latha"/>
+                <w:sz w:val="28"/>
+                <w:szCs w:val="28"/>
+              </w:rPr>
+              <w:t>-  [  ]</w:t>
+            </w:r>
+            <w:proofErr w:type="gramEnd"/>
+            <w:r>
+              <w:rPr>
+                <w:rFonts w:ascii="Latha" w:hAnsi="Latha" w:cs="Latha"/>
+                <w:sz w:val="28"/>
+                <w:szCs w:val="28"/>
+              </w:rPr>
+              <w:t xml:space="preserve">  </w:t>
             </w:r>
             <w:r>
               <w:rPr>
@@ -11214,13 +11375,23 @@
               </w:rPr>
               <w:t>ஞ்சோ</w:t>
             </w:r>
-            <w:r>
-              <w:rPr>
-                <w:rFonts w:ascii="Latha" w:hAnsi="Latha" w:cs="Latha"/>
-                <w:sz w:val="28"/>
-                <w:szCs w:val="28"/>
-              </w:rPr>
-              <w:t xml:space="preserve">-  [  ]  </w:t>
+            <w:proofErr w:type="gramStart"/>
+            <w:r>
+              <w:rPr>
+                <w:rFonts w:ascii="Latha" w:hAnsi="Latha" w:cs="Latha"/>
+                <w:sz w:val="28"/>
+                <w:szCs w:val="28"/>
+              </w:rPr>
+              <w:t>-  [  ]</w:t>
+            </w:r>
+            <w:proofErr w:type="gramEnd"/>
+            <w:r>
+              <w:rPr>
+                <w:rFonts w:ascii="Latha" w:hAnsi="Latha" w:cs="Latha"/>
+                <w:sz w:val="28"/>
+                <w:szCs w:val="28"/>
+              </w:rPr>
+              <w:t xml:space="preserve">  </w:t>
             </w:r>
             <w:r>
               <w:rPr>
@@ -12021,7 +12192,6 @@
                 <w:sz w:val="28"/>
                 <w:szCs w:val="28"/>
               </w:rPr>
-              <w:lastRenderedPageBreak/>
               <w:t>TS 6.2.</w:t>
             </w:r>
             <w:r>
@@ -12494,6 +12664,7 @@
                 <w:sz w:val="28"/>
                 <w:szCs w:val="28"/>
               </w:rPr>
+              <w:lastRenderedPageBreak/>
               <w:t>TS 6.3.3.2 - Vaakyam</w:t>
             </w:r>
           </w:p>
@@ -18823,15 +18994,16 @@
                 <w:sz w:val="32"/>
                 <w:szCs w:val="32"/>
               </w:rPr>
-              <w:t>it is only “B</w:t>
-            </w:r>
+              <w:t>it is only “</w:t>
+            </w:r>
+            <w:proofErr w:type="spellStart"/>
             <w:r>
               <w:rPr>
                 <w:rFonts w:cs="Arial"/>
                 <w:sz w:val="32"/>
                 <w:szCs w:val="32"/>
               </w:rPr>
-              <w:t>R</w:t>
+              <w:t>B</w:t>
             </w:r>
             <w:r>
               <w:rPr>
@@ -18839,7 +19011,24 @@
                 <w:sz w:val="32"/>
                 <w:szCs w:val="32"/>
               </w:rPr>
-              <w:t>u”)</w:t>
+              <w:t>R</w:t>
+            </w:r>
+            <w:r>
+              <w:rPr>
+                <w:rFonts w:cs="Arial"/>
+                <w:sz w:val="32"/>
+                <w:szCs w:val="32"/>
+              </w:rPr>
+              <w:t>u</w:t>
+            </w:r>
+            <w:proofErr w:type="spellEnd"/>
+            <w:r>
+              <w:rPr>
+                <w:rFonts w:cs="Arial"/>
+                <w:sz w:val="32"/>
+                <w:szCs w:val="32"/>
+              </w:rPr>
+              <w:t>”)</w:t>
             </w:r>
           </w:p>
         </w:tc>
@@ -20936,7 +21125,25 @@
                 <w:sz w:val="32"/>
                 <w:szCs w:val="32"/>
               </w:rPr>
-              <w:t>(its “tta”</w:t>
+              <w:t>(its “</w:t>
+            </w:r>
+            <w:proofErr w:type="spellStart"/>
+            <w:r>
+              <w:rPr>
+                <w:bCs/>
+                <w:sz w:val="32"/>
+                <w:szCs w:val="32"/>
+              </w:rPr>
+              <w:t>tta</w:t>
+            </w:r>
+            <w:proofErr w:type="spellEnd"/>
+            <w:r>
+              <w:rPr>
+                <w:bCs/>
+                <w:sz w:val="32"/>
+                <w:szCs w:val="32"/>
+              </w:rPr>
+              <w:t>”</w:t>
             </w:r>
             <w:r>
               <w:rPr>
@@ -25393,7 +25600,29 @@
                 <w:szCs w:val="28"/>
                 <w:lang w:bidi="ta-IN"/>
               </w:rPr>
-              <w:t>TS 6.4.2.6  - Vaakyam</w:t>
+              <w:t xml:space="preserve">TS </w:t>
+            </w:r>
+            <w:proofErr w:type="gramStart"/>
+            <w:r>
+              <w:rPr>
+                <w:rFonts w:cs="Latha"/>
+                <w:b/>
+                <w:sz w:val="28"/>
+                <w:szCs w:val="28"/>
+                <w:lang w:bidi="ta-IN"/>
+              </w:rPr>
+              <w:t>6.4.2.6  -</w:t>
+            </w:r>
+            <w:proofErr w:type="gramEnd"/>
+            <w:r>
+              <w:rPr>
+                <w:rFonts w:cs="Latha"/>
+                <w:b/>
+                <w:sz w:val="28"/>
+                <w:szCs w:val="28"/>
+                <w:lang w:bidi="ta-IN"/>
+              </w:rPr>
+              <w:t xml:space="preserve"> Vaakyam</w:t>
             </w:r>
           </w:p>
           <w:p>
@@ -25803,22 +26032,40 @@
                 <w:sz w:val="32"/>
                 <w:szCs w:val="32"/>
               </w:rPr>
-              <w:t>(it is hraswam</w:t>
-            </w:r>
+              <w:t xml:space="preserve">(it is </w:t>
+            </w:r>
+            <w:proofErr w:type="spellStart"/>
             <w:r>
               <w:rPr>
                 <w:sz w:val="32"/>
                 <w:szCs w:val="32"/>
               </w:rPr>
-              <w:t xml:space="preserve"> or short </w:t>
-            </w:r>
+              <w:t>hraswam</w:t>
+            </w:r>
+            <w:proofErr w:type="spellEnd"/>
             <w:r>
               <w:rPr>
                 <w:sz w:val="32"/>
                 <w:szCs w:val="32"/>
               </w:rPr>
+              <w:t xml:space="preserve"> or </w:t>
+            </w:r>
+            <w:proofErr w:type="gramStart"/>
+            <w:r>
+              <w:rPr>
+                <w:sz w:val="32"/>
+                <w:szCs w:val="32"/>
+              </w:rPr>
+              <w:t xml:space="preserve">short </w:t>
+            </w:r>
+            <w:r>
+              <w:rPr>
+                <w:sz w:val="32"/>
+                <w:szCs w:val="32"/>
+              </w:rPr>
               <w:t>)</w:t>
             </w:r>
+            <w:proofErr w:type="gramEnd"/>
           </w:p>
           <w:p>
             <w:pPr>
@@ -25865,7 +26112,29 @@
                 <w:lang w:bidi="ta-IN"/>
               </w:rPr>
               <w:lastRenderedPageBreak/>
-              <w:t>TS 6.4.5.5  - Vaakyam</w:t>
+              <w:t xml:space="preserve">TS </w:t>
+            </w:r>
+            <w:proofErr w:type="gramStart"/>
+            <w:r>
+              <w:rPr>
+                <w:rFonts w:cs="Latha"/>
+                <w:b/>
+                <w:sz w:val="28"/>
+                <w:szCs w:val="28"/>
+                <w:lang w:bidi="ta-IN"/>
+              </w:rPr>
+              <w:t>6.4.5.5  -</w:t>
+            </w:r>
+            <w:proofErr w:type="gramEnd"/>
+            <w:r>
+              <w:rPr>
+                <w:rFonts w:cs="Latha"/>
+                <w:b/>
+                <w:sz w:val="28"/>
+                <w:szCs w:val="28"/>
+                <w:lang w:bidi="ta-IN"/>
+              </w:rPr>
+              <w:t xml:space="preserve"> Vaakyam</w:t>
             </w:r>
           </w:p>
           <w:p>
@@ -26311,7 +26580,29 @@
                 <w:szCs w:val="28"/>
                 <w:lang w:bidi="ta-IN"/>
               </w:rPr>
-              <w:t>TS 6.4.8.3  - Vaakyam</w:t>
+              <w:t xml:space="preserve">TS </w:t>
+            </w:r>
+            <w:proofErr w:type="gramStart"/>
+            <w:r>
+              <w:rPr>
+                <w:rFonts w:cs="Latha"/>
+                <w:b/>
+                <w:sz w:val="28"/>
+                <w:szCs w:val="28"/>
+                <w:lang w:bidi="ta-IN"/>
+              </w:rPr>
+              <w:t>6.4.8.3  -</w:t>
+            </w:r>
+            <w:proofErr w:type="gramEnd"/>
+            <w:r>
+              <w:rPr>
+                <w:rFonts w:cs="Latha"/>
+                <w:b/>
+                <w:sz w:val="28"/>
+                <w:szCs w:val="28"/>
+                <w:lang w:bidi="ta-IN"/>
+              </w:rPr>
+              <w:t xml:space="preserve"> Vaakyam</w:t>
             </w:r>
           </w:p>
           <w:p>
@@ -27185,7 +27476,7 @@
                 <w:rFonts w:ascii="Latha" w:hAnsi="Latha" w:cs="Latha"/>
                 <w:sz w:val="28"/>
                 <w:szCs w:val="28"/>
-                <w:highlight w:val="yellow"/>
+                <w:highlight w:val="green"/>
                 <w:cs/>
                 <w:lang w:bidi="ta-IN"/>
               </w:rPr>
@@ -27196,7 +27487,7 @@
                 <w:rFonts w:ascii="Latha" w:hAnsi="Latha" w:cs="Latha"/>
                 <w:sz w:val="28"/>
                 <w:szCs w:val="28"/>
-                <w:highlight w:val="yellow"/>
+                <w:highlight w:val="green"/>
                 <w:cs/>
                 <w:lang w:bidi="ta-IN"/>
               </w:rPr>
@@ -29616,7 +29907,16 @@
                 <w:sz w:val="28"/>
                 <w:szCs w:val="28"/>
               </w:rPr>
-              <w:t xml:space="preserve">- </w:t>
+              <w:t>-</w:t>
+            </w:r>
+            <w:proofErr w:type="gramStart"/>
+            <w:r>
+              <w:rPr>
+                <w:rFonts w:ascii="Latha" w:hAnsi="Latha" w:cs="Latha"/>
+                <w:sz w:val="28"/>
+                <w:szCs w:val="28"/>
+              </w:rPr>
+              <w:t xml:space="preserve"> </w:t>
             </w:r>
             <w:r>
               <w:rPr>
@@ -29634,7 +29934,16 @@
                 <w:sz w:val="28"/>
                 <w:szCs w:val="28"/>
               </w:rPr>
-              <w:t xml:space="preserve"> [  ]   </w:t>
+              <w:t xml:space="preserve"> [  ]</w:t>
+            </w:r>
+            <w:proofErr w:type="gramEnd"/>
+            <w:r>
+              <w:rPr>
+                <w:rFonts w:ascii="Latha" w:hAnsi="Latha" w:cs="Latha"/>
+                <w:sz w:val="28"/>
+                <w:szCs w:val="28"/>
+              </w:rPr>
+              <w:t xml:space="preserve">   </w:t>
             </w:r>
             <w:r>
               <w:rPr>
@@ -29813,7 +30122,16 @@
                 <w:sz w:val="28"/>
                 <w:szCs w:val="28"/>
               </w:rPr>
-              <w:t xml:space="preserve">- </w:t>
+              <w:t>-</w:t>
+            </w:r>
+            <w:proofErr w:type="gramStart"/>
+            <w:r>
+              <w:rPr>
+                <w:rFonts w:ascii="Latha" w:hAnsi="Latha" w:cs="Latha"/>
+                <w:sz w:val="28"/>
+                <w:szCs w:val="28"/>
+              </w:rPr>
+              <w:t xml:space="preserve"> </w:t>
             </w:r>
             <w:r>
               <w:rPr>
@@ -29831,7 +30149,16 @@
                 <w:sz w:val="28"/>
                 <w:szCs w:val="28"/>
               </w:rPr>
-              <w:t xml:space="preserve"> [  ]   </w:t>
+              <w:t xml:space="preserve"> [  ]</w:t>
+            </w:r>
+            <w:proofErr w:type="gramEnd"/>
+            <w:r>
+              <w:rPr>
+                <w:rFonts w:ascii="Latha" w:hAnsi="Latha" w:cs="Latha"/>
+                <w:sz w:val="28"/>
+                <w:szCs w:val="28"/>
+              </w:rPr>
+              <w:t xml:space="preserve">   </w:t>
             </w:r>
             <w:r>
               <w:rPr>
@@ -31283,6 +31610,7 @@
         </w:rPr>
         <w:t>31</w:t>
       </w:r>
+      <w:proofErr w:type="gramStart"/>
       <w:r>
         <w:rPr>
           <w:b/>
@@ -31322,7 +31650,18 @@
           <w:szCs w:val="32"/>
           <w:u w:val="single"/>
         </w:rPr>
-        <w:t xml:space="preserve">January </w:t>
+        <w:t>January</w:t>
+      </w:r>
+      <w:proofErr w:type="gramEnd"/>
+      <w:r>
+        <w:rPr>
+          <w:b/>
+          <w:bCs/>
+          <w:sz w:val="32"/>
+          <w:szCs w:val="32"/>
+          <w:u w:val="single"/>
+        </w:rPr>
+        <w:t xml:space="preserve"> </w:t>
       </w:r>
       <w:r>
         <w:rPr>
@@ -32520,6 +32859,7 @@
       <w:pBdr>
         <w:top w:val="single" w:sz="4" w:space="1" w:color="auto"/>
       </w:pBdr>
+      <w:jc w:val="right"/>
       <w:rPr>
         <w:b/>
         <w:bCs/>
@@ -32530,7 +32870,21 @@
         <w:b/>
         <w:bCs/>
       </w:rPr>
-      <w:t xml:space="preserve">                                                                               www.v</w:t>
+      <w:t xml:space="preserve">                                                                         </w:t>
+    </w:r>
+    <w:r>
+      <w:rPr>
+        <w:b/>
+        <w:bCs/>
+      </w:rPr>
+      <w:t xml:space="preserve">    </w:t>
+    </w:r>
+    <w:r>
+      <w:rPr>
+        <w:b/>
+        <w:bCs/>
+      </w:rPr>
+      <w:t xml:space="preserve">  www.v</w:t>
     </w:r>
     <w:r>
       <w:rPr>
@@ -32558,6 +32912,13 @@
         <w:b/>
         <w:bCs/>
       </w:rPr>
+      <w:t xml:space="preserve">   </w:t>
+    </w:r>
+    <w:r>
+      <w:rPr>
+        <w:b/>
+        <w:bCs/>
+      </w:rPr>
       <w:tab/>
       <w:t xml:space="preserve"> </w:t>
     </w:r>
@@ -32568,7 +32929,7 @@
       <w:tab/>
     </w:r>
     <w:r>
-      <w:tab/>
+      <w:t xml:space="preserve">           </w:t>
     </w:r>
     <w:r>
       <w:rPr>
@@ -32675,6 +33036,7 @@
       <w:pBdr>
         <w:top w:val="single" w:sz="4" w:space="1" w:color="auto"/>
       </w:pBdr>
+      <w:jc w:val="right"/>
       <w:rPr>
         <w:b/>
         <w:bCs/>
@@ -32727,6 +33089,13 @@
         <w:b/>
         <w:bCs/>
       </w:rPr>
+      <w:t xml:space="preserve">   </w:t>
+    </w:r>
+    <w:r>
+      <w:rPr>
+        <w:b/>
+        <w:bCs/>
+      </w:rPr>
       <w:t>v</w:t>
     </w:r>
     <w:r>
@@ -32758,7 +33127,7 @@
       <w:tab/>
     </w:r>
     <w:r>
-      <w:tab/>
+      <w:t xml:space="preserve">                      </w:t>
     </w:r>
     <w:r>
       <w:rPr>
@@ -33365,7 +33734,6 @@
     <w:basedOn w:val="Normal"/>
     <w:link w:val="HeaderChar"/>
     <w:uiPriority w:val="99"/>
-    <w:semiHidden/>
     <w:unhideWhenUsed/>
     <w:rsid w:val="001C43F2"/>
     <w:pPr>
@@ -33379,7 +33747,6 @@
     <w:name w:val="Header Char"/>
     <w:link w:val="Header"/>
     <w:uiPriority w:val="99"/>
-    <w:semiHidden/>
     <w:rsid w:val="001C43F2"/>
     <w:rPr>
       <w:rFonts w:ascii="Arial" w:hAnsi="Arial"/>
@@ -33393,7 +33760,6 @@
     <w:basedOn w:val="Normal"/>
     <w:link w:val="FooterChar"/>
     <w:uiPriority w:val="99"/>
-    <w:semiHidden/>
     <w:unhideWhenUsed/>
     <w:rsid w:val="001C43F2"/>
     <w:pPr>
@@ -33407,7 +33773,6 @@
     <w:name w:val="Footer Char"/>
     <w:link w:val="Footer"/>
     <w:uiPriority w:val="99"/>
-    <w:semiHidden/>
     <w:rsid w:val="001C43F2"/>
     <w:rPr>
       <w:rFonts w:ascii="Arial" w:hAnsi="Arial"/>

</xml_diff>